<commit_message>
Align training content to two-hour duration
</commit_message>
<xml_diff>
--- a/02_Facilitator-Guide/facilitator-guide.docx
+++ b/02_Facilitator-Guide/facilitator-guide.docx
@@ -33,7 +33,7 @@
           <w:sz w:val="24"/>
           <w:szCs w:val="24"/>
         </w:rPr>
-        <w:t xml:space="preserve">21 Julai 2026 (Selasa) · 10.00 pagi – 11.00 pagi · PM Dr. Mohd Murtadha Mohamad</w:t>
+        <w:t xml:space="preserve">21 Julai 2026 (Selasa) · 10.00 pagi–12.00 tengah hari · PM Dr. Mohd Murtadha Mohamad</w:t>
       </w:r>
     </w:p>
     <w:p>
@@ -75,7 +75,7 @@
           <w:sz w:val="22"/>
           <w:szCs w:val="22"/>
         </w:rPr>
-        <w:t xml:space="preserve">Help participants recognise practical daily-productivity opportunities for Agentic AI, design a reusable assistant, and build and test it in Gemini Gems. The full agenda requires 120 minutes; the advertised 10.00–11.00 pagi slot must be extended or compressed before distribution.</w:t>
+        <w:t xml:space="preserve">Help participants recognise practical daily-productivity opportunities for Agentic AI, design a reusable assistant, and build and test it in Gemini Gems within the confirmed two-hour session.</w:t>
       </w:r>
     </w:p>
     <w:p>

</xml_diff>